<commit_message>
Proofcheck Inn Trouble Spanish: MINOR (12 fixes)
Co-Authored-By: Claude Opus 5.5 <noreply@anthropic.com>
Claude-Session: https://claude.ai/code/session_012Cm8JxdqzjuttdUSdkQCUg
</commit_message>
<xml_diff>
--- a/translated/corrected/Inn Trouble - ASSEMBLED - FORMATTED_Spanish.docx
+++ b/translated/corrected/Inn Trouble - ASSEMBLED - FORMATTED_Spanish.docx
@@ -3022,7 +3022,7 @@
     </w:p>
     <w:p>
       <w:r>
-        <w:t>—Tenía mal aspecto —dijo Martha, y me miró cuando lo dijo.</w:t>
+        <w:t>—Parecía cansada —dijo Martha, y me miró cuando lo dijo.</w:t>
       </w:r>
     </w:p>
     <w:p>
@@ -3287,7 +3287,7 @@
     <w:p/>
     <w:p>
       <w:r>
-        <w:t xml:space="preserve">—Es una firma de verdad —dijo, antes de que yo siquiera pudiera saludar—. Antigua, a dos estados de distancia, hace lo que dice tu hombre, sucesiones y herencias y rastreo de bienes perdidos para abogados a los que les sobra más dinero que tiempo. Y hay una sucesión Blackburn, Jessica, una de verdad, en curso. La última descendiente de la línea de Adelaide Blackburn murió abajo en la ciudad esta primavera, sin hijos, sin un testamento que valga la pena, y dejó un embrollo monumental. Nuestro alcalde es del bando de los primos, el bando que heredó la nariz y nada del dinero. Él no está metido en esto. Carter figura en los registros de la firma como el investigador que contrataron para desatar el ovillo. Lo supe por una empleada que me confirmó todo el asunto sin darse cuenta ni una sola vez de que estaba confirmando nada. Es exactamente, con precisión, lo que te dijo que era. Un fisgón con licencia y una cuenta de gastos.</w:t>
+        <w:t xml:space="preserve">—Es una firma de verdad —dijo, antes de que yo siquiera pudiera saludar—. Antigua, a dos estados de distancia, hace lo que dice ese hombre, sucesiones y herencias y rastreo de bienes perdidos para abogados a los que les sobra más dinero que tiempo. Y hay una sucesión Blackburn, Jessica, una de verdad, en curso. La última descendiente de la línea de Adelaide Blackburn murió abajo en la ciudad esta primavera, sin hijos, sin un testamento que valga la pena, y dejó un embrollo monumental. Nuestro alcalde es del bando de los primos, el bando que heredó la nariz y nada del dinero. Él no está metido en esto. Carter figura en los registros de la firma como el investigador que contrataron para desatar el ovillo. Lo supe por una empleada que me confirmó todo el asunto sin darse cuenta ni una sola vez de que estaba confirmando nada. Es exactamente, con precisión, lo que te dijo que era. Un fisgón con licencia y una cuenta de gastos.</w:t>
       </w:r>
     </w:p>
     <w:p/>
@@ -3717,7 +3717,7 @@
     <w:p/>
     <w:p>
       <w:r>
-        <w:t>Pero yo había ido a buscar algo más que consuelo. Volví a girar la nota y miré, esta vez, no las crueles palabritas, sino el papel sobre el que reposaban. De color crema. Un tacto pesado entre los dedos. Las tenues líneas verjuradas marcadas en el grano, finas y paralelas, que uno solo capta cuando sostiene algo a la luz. La misma que la primera nota, y la misma que el montón que había visto sobre un escritorio junto a la puerta de la Sociedad Histórica la mañana en que se inauguró la exposición. La segunda nota solo lo confirmaba. El chantajista seguía escribiendo lo que decían las cartas de los Blackburn en el papel de la Sociedad.</w:t>
+        <w:t>Pero yo había ido a buscar algo más que consuelo. Volví a girar la nota y miré, esta vez, no las crueles palabritas, sino el papel sobre el que reposaban. De color crema. Un tacto pesado entre los dedos. Las tenues líneas verjuradas marcadas en el grano, finas y paralelas, que uno solo capta cuando sostiene algo a la luz. El mismo que el de la primera nota, y el mismo que el del montón que había visto sobre un escritorio junto a la puerta de la Sociedad Histórica la mañana en que se inauguró la exposición. La segunda nota solo lo confirmaba. El chantajista seguía escribiendo lo que decían las cartas de los Blackburn en el papel de la Sociedad.</w:t>
       </w:r>
     </w:p>
     <w:p/>
@@ -3926,7 +3926,7 @@
         <w:t xml:space="preserve">El zafiro en su corazón</w:t>
       </w:r>
       <w:r>
-        <w:t xml:space="preserve">: cinco palabras, la redacción de un historiador y no la de un ladrón, plasmadas en la nota de extorsión exactamente igual que en la ficha con la cuidadosa caligrafía inclinada de Theo. La nota estaba escrita en el papel de carta crema de la Sociedad, el pesado papel verjurado que había visto apilado en el mostrador de recepción de la exposición. El hombre que dirigía el archivo se estaba ahogando. Había golpeado en todas las puertas honestas de tres estados y las había visto cerrarse. Se había plantado ante todo el pueblo para anunciar, con pesar, que las mismísimas cartas que describían el broche se habían extraviado.</w:t>
+        <w:t xml:space="preserve">: cinco palabras, la redacción de un historiador y no la de un ladrón, plasmadas en la nota de chantaje exactamente igual que en la ficha con la cuidadosa caligrafía inclinada de Theo. La nota estaba escrita en el papel de carta crema de la Sociedad, el pesado papel verjurado que había visto apilado en el mostrador de recepción de la exposición. El hombre que dirigía el archivo se estaba ahogando. Había golpeado en todas las puertas honestas de tres estados y las había visto cerrarse. Se había plantado ante todo el pueblo para anunciar, con pesar, que las mismísimas cartas que describían el broche se habían extraviado.</w:t>
       </w:r>
     </w:p>
     <w:p>
@@ -4270,7 +4270,7 @@
     <w:p/>
     <w:p>
       <w:r>
-        <w:t>La jefa Tanaka me escuchó en su pequeño despacho de la comisaría, con su libreta gastada abierta sobre el escritorio frente a ella y el bolígrafo quieto encima. No escribía mientras decidía si creerte o no. Se lo expuse todo tal y como se lo había expuesto a mí misma en la mesa de la cocina. Las dos notas. La ficha de catálogo de Theo con las cinco palabras coincidentes. El papel de carta de la Sociedad, con la misma textura al trasluz bajo la lámpara. La escritura de propiedad de la posada fuera de su cajón en la bandeja de archivo de Vera. Constance, el broche, la casa de empeños de Ridgeline, toda la raíz centenaria del asunto, y la carpeta de Neil debajo de todo lo demás, la parte que convertía esa raíz en algo humano.</w:t>
+        <w:t>La jefa Tanaka me escuchó en su pequeño despacho de la comisaría, con su libreta gastada abierta sobre el escritorio frente a ella y el bolígrafo quieto encima. No escribía mientras decidía si creerte o no. Se lo expuse todo tal y como se lo había expuesto a mí misma en la mesa de la cocina. Las dos notas. La ficha de catálogo de Theo con las cinco palabras coincidentes. El papel de carta de la Sociedad, con la misma textura al trasluz bajo la lámpara. La escritura de propiedad de la posada fuera de su cajón en la cesta de rearchivo de Vera. Constance, el broche, la casa de empeños de Ridgeline, toda la raíz centenaria del asunto, y la carpeta de Neil debajo de todo lo demás, la parte que convertía esa raíz en algo humano.</w:t>
       </w:r>
     </w:p>
     <w:p/>
@@ -4437,7 +4437,7 @@
     </w:p>
     <w:p>
       <w:r>
-        <w:t xml:space="preserve">—Theo —dije—. Las notas de chantaje a Fiona fueron escritas en el papel con membrete de la Sociedad. La cartulina gruesa de tono crema con verjura. Lo comparé fibra por fibra con una hoja de tus existencias.</w:t>
+        <w:t xml:space="preserve">—Theo —dije—. Las notas de chantaje a Fiona fueron escritas en el papel de carta de la Sociedad. El papel grueso de tono crema, verjurado. Lo comparé fibra por fibra con una hoja de tus existencias.</w:t>
       </w:r>
     </w:p>
     <w:p>
@@ -4674,7 +4674,7 @@
     <w:p/>
     <w:p>
       <w:r>
-        <w:t>Fiona era libre. Las notas habían cesado. El secreto había salido a la luz de la oscuridad, y una vez fuera de la oscuridad ya no le quedaban dientes. Dos personas que se habían perdido lo estaban afrontando ahora y empezaban, apenas empezando, la larga caminata de regreso hacia sí mismas.</w:t>
+        <w:t>Fiona era libre. Las notas habían cesado. El secreto había salido de la oscuridad, y una vez fuera de la oscuridad ya no le quedaban dientes. Dos personas que se habían perdido lo estaban afrontando ahora y empezaban, apenas empezando, la larga caminata de regreso hacia sí mismas.</w:t>
       </w:r>
     </w:p>
     <w:p/>
@@ -5282,7 +5282,7 @@
     <w:p/>
     <w:p>
       <w:r>
-        <w:t>Nueva harina. Nueva agua. Una báscula prestada. Sigue agrio. Para el jueves, Greta está de pie en su propia pastelería diciéndole a Jessica Claus que sus manos por fin han olvidado cómo hacerlo.</w:t>
+        <w:t>Nueva harina. Nueva agua. Una báscula prestada. Sigue agrio. Para el jueves, Greta está de pie en su propia panadería diciéndole a Jessica Claus que sus manos por fin han olvidado cómo hacerlo.</w:t>
       </w:r>
     </w:p>
     <w:p/>
@@ -5366,7 +5366,7 @@
     <w:p/>
     <w:p>
       <w:r>
-        <w:t>Había nevado durante la noche. No la nevada temprana de octubre, desaparecida en un abrir y cerrar de días templados. Nieve de verdad. De esa de plena temporada que había empezado en Todos los Santos y duraría hasta la primavera. Ahora cubría la avenida Evergreen con unos buenos y limpios quince centímetros, crujiendo bajo los pies cuando alguien entraba pisando fuerte. Durante el fin de semana, las tiendas habían cambiado sus esqueletos y calabazas de Halloween por tallos de maíz y pavos de papel, aunque las calabazas lisas seguían en los porches, buenas hasta Acción de Gracias. La avenida se había quedado silenciosa después de Halloween, en la tregua previa al largo y brillante impulso hacia la Navidad.</w:t>
+        <w:t>Había nevado durante la noche. No la nevada temprana de octubre, desaparecida en un abrir y cerrar de días templados. Nieve de verdad. De esa de plena temporada que había empezado en Halloween y duraría hasta la primavera. Ahora cubría la avenida Evergreen con unos buenos y limpios quince centímetros, crujiendo bajo los pies cuando alguien entraba pisando fuerte. Durante el fin de semana, las tiendas habían cambiado sus esqueletos y calabazas de Halloween por tallos de maíz y pavos de papel, aunque las calabazas lisas seguían en los porches, buenas hasta Acción de Gracias. La avenida se había quedado silenciosa después de Halloween, en la tregua previa al largo y brillante impulso hacia la Navidad.</w:t>
       </w:r>
     </w:p>
     <w:p/>
@@ -5420,7 +5420,7 @@
     <w:p/>
     <w:p>
       <w:r>
-        <w:t xml:space="preserve">Dot soltó su risita corta y seca desde el otro lado del círculo, sin apartar los ojos de su propia corona, que ya era casi el doble que la de cualquiera de las demás y el doble de densa. </w:t>
+        <w:t xml:space="preserve">Dot soltó su risita corta y seca desde el otro lado del círculo, sin apartar los ojos de su propia corona, que ya era la mitad más grande que la de cualquier otra y el doble de densa. </w:t>
       </w:r>
     </w:p>
     <w:p/>
@@ -5522,7 +5522,7 @@
     <w:p/>
     <w:p>
       <w:r>
-        <w:t xml:space="preserve">—Me ha salido del horno una bandeja de magdalenas de chocolate y nuez no hace ni una hora y me he dicho: Greta, ¿quién estará sentada en una tienda fría haciéndose útil esta mañana?, y la respuesta era todas vosotras, así que tomad.</w:t>
+        <w:t xml:space="preserve">—Me ha salido del horno una bandeja de magdalenas de chocolate y pacana no hace ni una hora y me he dicho: Greta, ¿quién estará sentada en una tienda fría haciéndose útil esta mañana?, y la respuesta era todas vosotras, así que tomad.</w:t>
       </w:r>
     </w:p>
     <w:p/>
@@ -5540,7 +5540,7 @@
     <w:p/>
     <w:p>
       <w:r>
-        <w:t xml:space="preserve">Ya estaba levantando la tapa. El olor salió y se mezcló con el abeto en el centro de la estancia, chocolate, nuez y azúcar moreno sobre pino verde y frío. Era, pensé, lo más parecido al olor de toda la temporada venidera que conocía. </w:t>
+        <w:t xml:space="preserve">Ya estaba levantando la tapa. El olor salió y se mezcló con el abeto en el centro de la estancia, chocolate, pacana y azúcar moreno sobre pino verde y frío. Era, pensé, lo más parecido al olor de toda la temporada venidera que conocía. </w:t>
       </w:r>
     </w:p>
     <w:p/>

</xml_diff>

<commit_message>
Full proofcheck Inn Trouble Spanish: SIGNIFICANT (45 edits)
Co-Authored-By: Claude Opus 5.5 <noreply@anthropic.com>
Claude-Session: https://claude.ai/code/session_012Cm8JxdqzjuttdUSdkQCUg
</commit_message>
<xml_diff>
--- a/translated/corrected/Inn Trouble - ASSEMBLED - FORMATTED_Spanish.docx
+++ b/translated/corrected/Inn Trouble - ASSEMBLED - FORMATTED_Spanish.docx
@@ -248,7 +248,7 @@
     </w:p>
     <w:p>
       <w:r>
-        <w:t>—Es la tranquilidad —dijo la señora Worthington—. Y las colchas. No paro de preguntar quién las hizo.</w:t>
+        <w:t>—Es la tranquilidad —dijo la señora Worthington—. Y las colchas. Siempre se me olvida preguntar quién las hizo.</w:t>
       </w:r>
     </w:p>
     <w:p>
@@ -303,7 +303,7 @@
     </w:p>
     <w:p>
       <w:r>
-        <w:t>Veinte dólares. Le di vueltas a aquello en la cabeza como a una piedra encontrada en el zapato. Era una suma tan pequeña como para sembrar semejante tensión en la voz de dos buenas personas. Sam no era un hombre capaz de acosar a un amigo por veinte dólares. Fiona no era una mujer que dejara pasar una factura durante tres semanas. Algo fundamental entre los dos se había roto.</w:t>
+        <w:t>Veinte dólares. Le di vueltas a aquello en la cabeza como a una piedra encontrada en el zapato. Era una suma demasiado pequeña para sembrar semejante tensión en la voz de dos buenas personas. Sam no era un hombre capaz de acosar a un amigo por veinte dólares. Fiona no era una mujer que dejara pasar una factura durante tres semanas. Algo se había soltado bajo los pies de ambos.</w:t>
       </w:r>
     </w:p>
     <w:p>
@@ -368,7 +368,7 @@
     </w:p>
     <w:p>
       <w:r>
-        <w:t>—Por supuesto. Claro que sí. —Hizo clic con su bolígrafo, se lo guardó en el bolsillo de la camisa y me dedicó una ligera inclinación de cabeza—. Bien. Un verdadero placer, señora Claus. Supongo que nos veremos por aquí. Es esa clase de pueblo, ¿verdad? Todo el mundo ve a todo el mundo. —Y se fue callejeando hacia las escaleras con las manos en los bolsillos, mirando hacia arriba al medallón de yeso conforme avanzaba.</w:t>
+        <w:t>—Por supuesto. Claro que sí. —Hizo clic con su bolígrafo, se lo guardó en el bolsillo de la camisa y me dedicó una ligera inclinación de cabeza—. Bien. Un verdadero placer, señora Claus. Supongo que nos veremos por aquí. Es esa clase de pueblo, ¿verdad? Todo el mundo ve a todo el mundo. —Y se alejó sin prisa hacia las escaleras con las manos en los bolsillos, mirando hacia arriba al medallón de yeso conforme avanzaba.</w:t>
       </w:r>
     </w:p>
     <w:p>
@@ -674,7 +674,7 @@
     <w:p/>
     <w:p>
       <w:r>
-        <w:t>Volví a coger la nota y la leí otra vez, con más atención en esta ocasión, y al acercarla para leer el garabato apretado, desprendía un olor. Tenue, pero ahí estaba. Afilado, un poco metálico, con algo mineral en el fondo. Lo reconocía de hacía poco y no lograba, por nada del mundo, recordar de dónde.</w:t>
+        <w:t>Volví a coger la nota y la leí otra vez, con más atención en esta ocasión, y al acercarla para leer el garabato apretado, desprendía un olor. Tenue, pero ahí estaba. Penetrante, un poco metálico, con algo mineral en el fondo. Lo reconocía de hacía poco y no lograba, por nada del mundo, recordar de dónde.</w:t>
       </w:r>
     </w:p>
     <w:p/>
@@ -770,7 +770,7 @@
     <w:p/>
     <w:p>
       <w:r>
-        <w:t>Lo que dejaba el otro.</w:t>
+        <w:t>Así que quedaba el otro.</w:t>
       </w:r>
     </w:p>
     <w:p/>
@@ -797,7 +797,7 @@
     </w:p>
     <w:p>
       <w:r>
-        <w:t>Nick sabía leerme con solo cruzar la habitación. Entré sacudiéndome el frío de las botas, me echó un solo vistazo a la cara y no me hizo ni una sola pregunta. Sirvió dos platos hondos de algo que llevaba cebada, zanahorias y lo último de los puerros de otoño, los puso en la mesa de la cocina y me apartó la silla. Esperó a que me tomara tres cucharadas antes de levantar siquiera una ceja.</w:t>
+        <w:t>Nick sabía leerme desde el otro extremo de una habitación. Entré sacudiéndome el frío de las botas, me echó un solo vistazo a la cara y no me hizo ni una sola pregunta. Sirvió dos platos hondos de algo que llevaba cebada, zanahorias y lo último de los puerros de otoño, los puso en la mesa de la cocina y me apartó la silla. Esperó a que me tomara tres cucharadas antes de levantar siquiera una ceja.</w:t>
       </w:r>
     </w:p>
     <w:p>
@@ -1058,7 +1058,7 @@
     <w:p/>
     <w:p>
       <w:r>
-        <w:t>—¡Jessica! Viniste. —Se acercó a mí y me tomó las manos entre las suyas. Las tenía frías y sentí el leve temblor en ellas—. ¿No es increíble? Míralo. Doscientos años de este pueblo, al fin bajo un mismo techo. No paro de recorrerlo y de no creer que lo haya conseguido. —Se inclinó hacia delante, bajando la voz como si confiara un gran secreto—. Entra, entra. Diré unas pocas palabras en cuanto todos se hayan reunido y luego tienes que mirarlo todo. Cada mínimo fragmento. Lo digo en serio. Quiero que alguien lea de verdad los carteles. La gente pasa de largo ante los carteles.</w:t>
+        <w:t>—¡Jessica! Has venido. —Se acercó a mí y me tomó las manos entre las suyas. Las tenía frías y sentí el leve temblor en ellas—. ¿No es increíble? Míralo. Doscientos años de este pueblo, al fin bajo un mismo techo. No paro de recorrerlo y de no creer que lo haya conseguido. —Se inclinó hacia delante, bajando la voz como si confiara un gran secreto—. Entra, entra. Diré unas pocas palabras en cuanto todos se hayan reunido y luego tienes que mirarlo todo. Cada mínimo fragmento. Lo digo en serio. Quiero que alguien lea de verdad los carteles. La gente pasa de largo ante los carteles.</w:t>
       </w:r>
     </w:p>
     <w:p/>
@@ -1184,7 +1184,7 @@
     <w:p/>
     <w:p>
       <w:r>
-        <w:t>El papel de las vitrinas era viejo, marrón, quebradizo por los dobleces. Pero en el mostrador delantero, junto a la caja plana de Vera, había una pila de papelería de la Sociedad, el material en blanco que usaban para las etiquetas y los membretes, de color crema, un poco más pesado que el papel ordinario, con una ligera textura verjurada impresa, finas líneas paralelas que uno solo captaría si lo sostuviera a la luz o tuviera motivos para fijarse.</w:t>
+        <w:t>El papel de las vitrinas era viejo, marrón, quebradizo por los dobleces. Pero en el mostrador delantero, junto a la caja plana de Vera, había una pila de papel de carta de la Sociedad, el material en blanco que usaban para las etiquetas y los membretes, de color crema, un poco más pesado que el papel ordinario, con una ligera textura verjurada impresa, finas líneas paralelas que uno solo captaría si lo sostuviera a la luz o tuviera motivos para fijarse.</w:t>
       </w:r>
     </w:p>
     <w:p/>
@@ -1220,13 +1220,13 @@
     <w:p/>
     <w:p>
       <w:r>
-        <w:t xml:space="preserve">Pero me lo guardé doblado en el bolsillo del abrigo de todos modos, junto a la nota. Me enderecé y volví a mirar la sala cálida y abarrotada por última vez. A Theo, agachado ahora junto a la mesa del zumo de manzana, contándole a un niño pequeño sobre la fundación del pueblo con todo su corazón cansado, con los ojos del niño muy abiertos. A Vera, junto al mostrador, cuadrando su caja de papeles medio centímetro más. A Neil Carter, junto al cristal, escribiendo algo en su libreta. Y a la pila de papelería crema junto al codo de Vera, atrapando la luz.</w:t>
-      </w:r>
-    </w:p>
-    <w:p/>
-    <w:p>
-      <w:r>
-        <w:t>Las cartas habían estado allí. El papel había estado allí.</w:t>
+        <w:t xml:space="preserve">Pero me lo guardé doblado en el bolsillo del abrigo de todos modos, junto a la nota. Me enderecé y volví a mirar la sala cálida y abarrotada por última vez. A Theo, agachado ahora junto a la mesa del zumo de manzana, contándole a un niño pequeño sobre la fundación del pueblo con todo su corazón cansado, con los ojos del niño muy abiertos. A Vera, junto al mostrador, cuadrando su caja de papeles medio centímetro más. A Neil Carter, junto al cristal, escribiendo algo en su libreta. Y a la pila de papel de carta crema junto al codo de Vera, atrapando la luz.</w:t>
+      </w:r>
+    </w:p>
+    <w:p/>
+    <w:p>
+      <w:r>
+        <w:t>Las cartas habían estado allí. El papel estaba allí.</w:t>
       </w:r>
     </w:p>
     <w:p/>
@@ -1356,7 +1356,7 @@
         <w:rPr>
           <w:i/>
         </w:rPr>
-        <w:t xml:space="preserve">Conocer el secreto de los papeles te indica dónde situarte</w:t>
+        <w:t xml:space="preserve">Saber que el secreto salió de los papeles te indica dónde situarte</w:t>
       </w:r>
       <w:r>
         <w:t xml:space="preserve">, había dicho Nick. </w:t>
@@ -1634,7 +1634,7 @@
     </w:p>
     <w:p>
       <w:r>
-        <w:t xml:space="preserve">—Dígaselo a Bram. La semana pasada le puse una advertencia a Comet en Maple Street y me dio las gracias por ello. —Una comisura de su boca se elevó—. Nadie me da las gracias por una advertencia.</w:t>
+        <w:t xml:space="preserve">—Dígaselo a Bram. La semana pasada le puse una advertencia por Comet en Maple Street y me dio las gracias por ello. —Una comisura de su boca se elevó—. Nadie me da las gracias por una advertencia.</w:t>
       </w:r>
     </w:p>
     <w:p>
@@ -1826,7 +1826,7 @@
     <w:p/>
     <w:p>
       <w:r>
-        <w:t>Ese era el motivo de mi visita. Me había llevado la nota anónima a la nariz una docena de veces desde que Fiona me la entregara, intentando identificar aquel leve matiz metálico que impregnaba el papel y, la noche anterior, mientras yacía despierta escuchando la respiración de Nick, lo había deducido. Era esto. Carbón, hierro candente y un trasfondo mineral, el aliento entero de una fragua en funcionamiento. Había venido para cerciorarme.</w:t>
+        <w:t>Ese era el motivo de mi visita. Me había llevado la nota de chantaje a la nariz una docena de veces desde que Fiona me la entregara, intentando identificar aquel leve matiz metálico que impregnaba el papel y, la noche anterior, mientras yacía despierta escuchando la respiración de Nick, lo había deducido. Era esto. Carbón, hierro candente y un trasfondo mineral, el aliento entero de una fragua en funcionamiento. Había venido para cerciorarme.</w:t>
       </w:r>
     </w:p>
     <w:p/>
@@ -2292,7 +2292,7 @@
     <w:p/>
     <w:p>
       <w:r>
-        <w:t>Ella aceptó esto como poco más que su merecido, luego miró fijamente el armario donde se guardaban las sardinas y consiguió una.</w:t>
+        <w:t>Ella aceptó esto como lo mínimo que se merecía, luego miró fijamente el armario donde se guardaban las sardinas y consiguió una.</w:t>
       </w:r>
     </w:p>
     <w:p/>
@@ -2384,13 +2384,13 @@
     <w:p/>
     <w:p>
       <w:r>
-        <w:t>Pip había descubierto los marcos de latón. Se quedó hocico con hocico con su reflejo en el inferior, admirándose a sí misma.</w:t>
-      </w:r>
-    </w:p>
-    <w:p/>
-    <w:p>
-      <w:r>
-        <w:t xml:space="preserve">—Lleva usted los registros de la propiedad —comenté con ligereza, como si solo estuviera haciendo conversación para llenar el silencio del rasgueo de la pluma—. Todo este tiempo atrás. Debe de ser útil para la gente. Apuesto a que medio pueblo acude a usted cuando quiere saber quién construyó su casa o a dónde fue a parar la tierra de su abuela.</w:t>
+        <w:t>Pip había descubierto los marcos de latón. Se quedó pico con pico con su reflejo en el inferior, admirándose a sí misma.</w:t>
+      </w:r>
+    </w:p>
+    <w:p/>
+    <w:p>
+      <w:r>
+        <w:t xml:space="preserve">—Lleva usted los registros de la propiedad —comenté con ligereza, como si solo estuviera haciendo conversación para llenar el silencio del rasgueo de la pluma—. Desde los más antiguos. Debe de ser útil para la gente. Apuesto a que medio pueblo acude a usted cuando quiere saber quién construyó su casa o a dónde fue a parar la tierra de su abuela.</w:t>
       </w:r>
     </w:p>
     <w:p/>
@@ -2664,7 +2664,7 @@
     <w:p/>
     <w:p>
       <w:r>
-        <w:t>Pero pretendía sospechar de él con justicia, y eso significaba comprobarlo incluso después de que mi corazón se hubiera decidido en su mayoría. Así que pregunté lo último que había venido a preguntar, con ligereza, como quien no quiere la cosa.</w:t>
+        <w:t>Pero pretendía sospechar de él con justicia, y eso significaba comprobarlo incluso después de que mi corazón casi lo hubiera decidido. Así que pregunté lo último que había venido a preguntar, con ligereza, como quien no quiere la cosa.</w:t>
       </w:r>
     </w:p>
     <w:p/>
@@ -2676,7 +2676,7 @@
     <w:p/>
     <w:p>
       <w:r>
-        <w:t xml:space="preserve">—¿Echarles un vistazo? —Rio, obligado a hacerlo por la sorpresa—. Señora Claus, yo estaba cargando vitrinas de dos en dos y tratando de no meter el pie en una silla de hace cien años. No leí ni una sola palabra. No habría sabido distinguir a un Blackburn de una mora. Theo me entregaba una caja y decía con cuidado ahora, con cuidado, esa es preciosa, y yo llevaba la caja preciosa adonde él señalaba e iba derecho a buscar la siguiente caja preciosa. —Sacudió la cabeza, sonriendo ante el recuerdo—. Para el final de la semana estaba tan machacado que habría firmado lo que fuera solo con tal de que me dejaran sentarme. Esa fue toda mi carrera como historiador.</w:t>
+        <w:t xml:space="preserve">—¿Echarles un vistazo? —Rio, obligado a hacerlo por la sorpresa—. Señora Claus, yo estaba cargando vitrinas de dos en dos y tratando de no meter el pie en una silla de hace cien años. No leí ni una sola palabra. No habría sabido distinguir a un Blackburn de una mora. Theo me entregaba una caja y decía con cuidado ahora, con cuidado, esa es valiosa, y yo llevaba la caja valiosa adonde él señalaba e iba derecho a buscar la siguiente caja valiosa. —Sacudió la cabeza, sonriendo ante el recuerdo—. Para el final de la semana estaba tan machacado que habría firmado lo que fuera solo con tal de que me dejaran sentarme. Esa fue toda mi carrera como historiador.</w:t>
       </w:r>
     </w:p>
     <w:p/>
@@ -2712,7 +2712,7 @@
     <w:p/>
     <w:p>
       <w:r>
-        <w:t>Estaba libre. La certeza de ello se asentó en mí con limpidez, y provocó dos cosas al mismo tiempo. Me dio alivio, porque Jamal me caía bien y no quería que fuera él.</w:t>
+        <w:t>Estaba descartado. La certeza de ello se asentó en mí con limpidez, y provocó dos cosas al mismo tiempo. Me dio alivio, porque Jamal me caía bien y no quería que fuera él.</w:t>
       </w:r>
     </w:p>
     <w:p/>
@@ -2987,7 +2987,7 @@
     </w:p>
     <w:p>
       <w:r>
-        <w:t>A Claire se le levantó la cabeza.</w:t>
+        <w:t>Claire levantó la cabeza.</w:t>
       </w:r>
     </w:p>
     <w:p>
@@ -3174,7 +3174,7 @@
     </w:p>
     <w:p>
       <w:r>
-        <w:t xml:space="preserve">—Pronto —dije—. Hay dos cabos sueltos que atar primero. Sam y el forastero. Quiero a ambos fuera de duda, descartados por completo, antes de dejarme entrar en ese archivo y mirar fijamente a Theo. Le debo al menos eso, no señalarlo hasta que no quede nadie más de quien sospechar. Y entonces iré, y examinaré las cartas, y averiguaré si las palabras coinciden.</w:t>
+        <w:t xml:space="preserve">—Pronto —dije—. Hay dos cabos sueltos que atar primero. Sam y el forastero. Quiero a ambos fuera de duda, descartados por completo, antes de permitirme entrar en ese archivo y mirar fijamente a Theo. Le debo al menos eso, no señalarlo hasta que no quede nadie más de quien sospechar. Y entonces iré, y examinaré las cartas, y averiguaré si las palabras coinciden.</w:t>
       </w:r>
     </w:p>
     <w:p>
@@ -3230,7 +3230,7 @@
     </w:p>
     <w:p>
       <w:r>
-        <w:t xml:space="preserve">—Extorsión. —Pronunció la palabra en voz baja, como si le dejara mal sabor de boca—. Fiona. Y yo llevo tres semanas plantado en su porche hecho una furia por veinte dólares mientras ella ha estado cargando con eso. —Se apretó con fuerza el talón de una mano contra la frente, dejando una mancha oscura allí—. Dígale que se lo perdono. Los veinte dólares, todo el encargo, cada centavo, dígale que no quiero volver a saber nada de eso en lo que me queda de vida. Dios. Lo empeoré, ¿verdad? Acosándola por dinero mientras se ahogaba. Lo empeoré y ni me enteré.</w:t>
+        <w:t xml:space="preserve">—Chantaje. —Pronunció la palabra en voz baja, como si le dejara mal sabor de boca—. Fiona. Y yo llevo tres semanas plantado en su porche hecho una furia por veinte dólares mientras ella ha estado cargando con eso. —Se apretó con fuerza el talón de una mano contra la frente, dejando una mancha oscura allí—. Dígale que se lo perdono. Los veinte dólares, todo el encargo, cada centavo, dígale que no quiero volver a saber nada de eso en lo que me queda de vida. Dios. Lo empeoré, ¿verdad? Acosándola por dinero mientras se ahogaba. Lo empeoré y ni me enteré.</w:t>
       </w:r>
     </w:p>
     <w:p>
@@ -3250,7 +3250,7 @@
     </w:p>
     <w:p>
       <w:r>
-        <w:t xml:space="preserve">El aroma de la nota nunca había sido el de Sam. Era el de su trabajo. Un herrero templa el hierro quemando aceite en él mientras aún está caliente, y los trabajos de hierro nuevos conservan ese humo durante semanas. El vestíbulo de Fiona estaba lleno de él, la barandilla de la escalera, la pantalla de la chimenea, los soportes que se colocaban en el porche, y el abrigo y la bolsa de herramientas de Sam habían estado colgados junto a su puerta todos los días durante tres semanas. Cada papel que reposaba en ese mostrador absorbía el olor. La nota también había estado allí. La pista que lo había puesto al principio de mi lista me había estado diciendo todo el tiempo dónde había estado la nota. No quién la había escrito. Lo había estado leyendo al revés. Ahora podía leerlo de la forma correcta, y la forma correcta lo exoneraba por completo y sin mancha.</w:t>
+        <w:t xml:space="preserve">El aroma de la nota nunca había sido el de Sam. Era el de su trabajo. Un herrero da el acabado al hierro quemando aceite en él mientras aún está caliente, y los trabajos de hierro nuevos conservan ese humo durante semanas. El vestíbulo de Fiona estaba lleno de él, la barandilla de la escalera, la pantalla de la chimenea, los soportes que se colocaban en el porche, y el abrigo y la bolsa de herramientas de Sam habían estado colgados junto a su puerta todos los días durante tres semanas. Cada papel que reposaba en ese mostrador absorbía el olor. La nota también había estado allí. La pista que lo había puesto al principio de mi lista me había estado diciendo todo el tiempo dónde había estado la nota. No quién la había escrito. Lo había estado leyendo al revés. Ahora podía leerlo de la forma correcta, y la forma correcta lo exoneraba por completo y sin mancha.</w:t>
       </w:r>
     </w:p>
     <w:p>
@@ -3323,7 +3323,7 @@
     <w:p/>
     <w:p>
       <w:r>
-        <w:t>—Están extorsionando a una amiga mía —le dije—. Por su broche. Por adónde fue a parar en 1924, y quién se lo llevó, y qué se compró con el dinero que sacó por él. Alguien amenaza a su familia con arruinarla con esa historia a menos que les pague medio millón de dólares que no tiene y que no podría juntar en diez años.</w:t>
+        <w:t>—Están chantajeando a una amiga mía —le dije—. Por su broche. Por adónde fue a parar en 1924, y quién se lo llevó, y qué se compró con el dinero que sacó por él. Alguien amenaza a su familia con arruinarla con esa historia a menos que les pague medio millón de dólares que no tiene y que no podría juntar en diez años.</w:t>
       </w:r>
     </w:p>
     <w:p/>
@@ -3744,7 +3744,7 @@
     <w:p/>
     <w:p>
       <w:r>
-        <w:t>Pero alguien sí podía. Alguien que se movía por este pueblo con tanta naturalidad que ninguna mirada se detendría jamás en él, que podía pasarse por la posada entre la multitud del festival, dejar algo, seguir su camino y no dejar ninguna onda en el agua. No alcanzaba a ver quién podía ser eso. Pero con dos notas en la mano, capturé el primer indicio de que la mano que las había escrito y la mano que las había llevado al vestíbulo tal vez no fueran la misma mano en absoluto.</w:t>
+        <w:t>Pero alguien sí podía. Alguien que se movía por este pueblo con tanta naturalidad que ninguna mirada se detendría jamás en él, que podía pasarse por la posada entre la multitud del festival, dejar algo, seguir su camino y no dejar ninguna onda en el agua. No alcanzaba a ver quién podía ser eso. Pero con dos notas en la mano, atisbé el primer indicio de que la mano que las había escrito y la mano que las había llevado al vestíbulo tal vez no fueran la misma mano en absoluto.</w:t>
       </w:r>
     </w:p>
     <w:p/>
@@ -3809,7 +3809,7 @@
     <w:p/>
     <w:p>
       <w:r>
-        <w:t>Una vez, a mitad de la tarde, creí que estaba ocurriendo. Una silueta se deslizó hasta el porche de la posada, se detuvo ante la puerta abierta, echó un vistazo a su alrededor y tendió la mano hacia el mostrador de recepción. Se me encogió el corazón. Me puse a cruzar el parque demasiado deprisa, y Sam ya se estaba moviendo de su puesto. Entonces la figura se dio la vuelta, y no era más que la señora Pelletier, de la junta directiva de la Sociedad, que dejaba un montón de folletos informativos sobre los socios en el mostrador para que los huéspedes los vieran. Sam y yo llegamos al mismo tiempo, desde direcciones opuestas, ambos demasiado deprisa, y cruzamos miradas por encima de los folletos. La señora Pelletier nos miró desconcertada a los dos. Cogí tres folletos que no necesitaba, Sam dijo algo sobre el tiempo y nos retiramos. Eso fue lo más cerca que estuvo el día de torcerse. Una falsa alarma. Pero me demostró la tensión que llevaba dentro, bajo la música del violín, y lo delgado que era el hilo entre la calidez y el miedo.</w:t>
+        <w:t>Una vez, a mitad de la tarde, creí que estaba ocurriendo. Una silueta se deslizó hasta el porche de la posada, se detuvo ante la puerta abierta, echó un vistazo a su alrededor y tendió la mano hacia el mostrador de recepción. Se me encogió el corazón. Me puse a cruzar el parque demasiado deprisa, y Sam ya se estaba moviendo de su puesto. Entonces la figura se dio la vuelta, y no era más que la señora Pelletier, de la junta directiva de la Sociedad, que dejaba un montón de folletos para captar socios en el mostrador para que los huéspedes los vieran. Sam y yo llegamos al mismo tiempo, desde direcciones opuestas, ambos demasiado deprisa, y cruzamos miradas por encima de los folletos. La señora Pelletier nos miró desconcertada a los dos. Cogí tres folletos que no necesitaba, Sam dijo algo sobre el tiempo y nos retiramos. Eso fue lo más cerca que estuvo el día de torcerse. Una falsa alarma. Pero me demostró la tensión que llevaba dentro, bajo la música del violín, y lo delgado que era el hilo entre la calidez y el miedo.</w:t>
       </w:r>
     </w:p>
     <w:p/>
@@ -4056,7 +4056,7 @@
     <w:p/>
     <w:p>
       <w:r>
-        <w:t xml:space="preserve">Había leído este. Lo había sacado. La escritura de la posada, el papel que registraba la compra de 1924, la mitad del secreto que no estaba en ninguna carta de los Blackburn y que nunca había estado. Había estado en las manos de Vera Reed, tan recientemente que aún no lo había guardado.</w:t>
+        <w:t xml:space="preserve">Había leído esta. La había sacado. La escritura de la posada, el papel que registraba la compra de 1924, la mitad del secreto que no estaba en ninguna carta de los Blackburn y que nunca había estado. Había estado en las manos de Vera Reed, tan recientemente que aún no la había guardado.</w:t>
       </w:r>
     </w:p>
     <w:p/>
@@ -4104,7 +4104,7 @@
     <w:p/>
     <w:p>
       <w:r>
-        <w:t>Vera sí podía. Vera tenía la escritura, la prueba de la compra, en los cajones detrás de su silla. Vera llevaba papeles de la oficina del alcalde al archivo, de un lado para otro, con la naturalidad del clima, con todo el acceso a Theo y a su papelería que una persona pudiera desear. Y Vera se movía por el pueblo sin llamar la atención, una mujer haciendo recados para el ayuntamiento. Podía dejar un sobre en el mostrador de recepción de la posada entre la multitud del festival y nadie sospecharía nada, la secretaria del alcalde pasándose por la posada. Yo misma me la había cruzado en las escaleras de la posada la mañana en que llegó la segunda nota, y no le había dado importancia.</w:t>
+        <w:t>Vera sí podía. Vera tenía la escritura, la prueba de la compra, en los cajones detrás de su silla. Vera llevaba papeles de la oficina del alcalde al archivo, de un lado para otro, con la naturalidad del clima, con todo el acceso a Theo y a su papel de carta que una persona pudiera desear. Y Vera se movía por el pueblo sin llamar la atención, una mujer haciendo recados para el ayuntamiento. Podía dejar un sobre en el mostrador de recepción de la posada entre la multitud del festival y nadie sospecharía nada, la secretaria del alcalde pasándose por la posada. Yo misma me la había cruzado en las escaleras de la posada la mañana en que llegó la segunda nota, y no le había dado importancia.</w:t>
       </w:r>
     </w:p>
     <w:p/>
@@ -4175,7 +4175,7 @@
     <w:p/>
     <w:p>
       <w:r>
-        <w:t xml:space="preserve">Unas palabras tranquilas en la oscuridad protegerían a todas las personas excepto a aquella a la que más debían proteger. No liberaría a Fiona. Solo cambiaría de manos el secreto. En ese momento lo tenía un chantajista. Después de mi apacible clemencia, lo tendría yo. También Nick, y también Theo y Vera, perdonados y libres, las únicas dos personas en el mundo entero que sabían exactamente cómo convertir el baúl de un desván en una fortuna. Fiona pasaría el resto de su vida sabiendo que dos de sus vecinos habían intentado extorsionarla una vez, que se habían salido con la suya y que, cualquier noche mala, en cualquier invierno desesperado a lo largo de los años, podrían volver a intentarlo. El miedo no terminaría. Solo se callaría. Yo había leído diez mil cartas en el Polo, y el dolor que contenían era muy a menudo un secreto llevado en soledad en la oscuridad.</w:t>
+        <w:t xml:space="preserve">Unas palabras tranquilas en la oscuridad protegerían a todas las personas excepto a aquella a la que más debían proteger. No liberarían a Fiona. Solo cambiarían de manos el secreto. En ese momento lo tenía un chantajista. Después de mi apacible clemencia, lo tendría yo. También Nick, y también Theo y Vera, perdonados y libres, las únicas dos personas en el mundo entero que sabían exactamente cómo convertir el baúl de un desván en una fortuna. Fiona pasaría el resto de su vida sabiendo que dos de sus vecinos habían intentado extorsionarla una vez, que se habían salido con la suya y que, cualquier noche mala, en cualquier invierno desesperado a lo largo de los años, podrían volver a intentarlo. El miedo no terminaría. Solo se callaría. Yo había leído diez mil cartas en el Polo, y el dolor que contenían era muy a menudo un secreto llevado en soledad en la oscuridad.</w:t>
       </w:r>
     </w:p>
     <w:p/>
@@ -4473,7 +4473,7 @@
     </w:p>
     <w:p>
       <w:r>
-        <w:t>—Me dije a mí mismo que no era un robo de verdad —dijo—. No a Fiona. Me dije que la posada se había comprado con dinero robado para empezar, así que quitarle una parte no era un robo, era, no sé, la historia corrigiéndose a sí misma, una cuenta que por fin se saldaba. Se me da tan bien hacer que el pasado signifique lo que necesito que signifique. Es la base de toda mi formación, hacer que el pasado cobre sentido.</w:t>
+        <w:t>—Me dije a mí mismo que no era un robo de verdad —dijo—. No a Fiona. Me dije que la posada se había comprado con dinero robado para empezar, así que recuperar una parte no era un robo, era, no sé, la historia corrigiéndose a sí misma, una cuenta que por fin se saldaba. Se me da tan bien hacer que el pasado signifique lo que necesito que signifique. Es la base de toda mi formación, hacer que el pasado cobre sentido.</w:t>
       </w:r>
     </w:p>
     <w:p>
@@ -4513,12 +4513,12 @@
     </w:p>
     <w:p>
       <w:r>
-        <w:t>Entonces me volví hacia Vera, y lo hice con suavidad, porque estaba allí sentada temblando, con los brazos cruzados alrededor de su cuerpo. Ya estaba casi a mitad de camino de la verdad por su cuenta.</w:t>
-      </w:r>
-    </w:p>
-    <w:p>
-      <w:r>
-        <w:t xml:space="preserve">—Vera —dije—. Theo tenía la parte del robo. Pero las notas sabían que la posada se había comprado con el dinero del broche, y eso jamás estuvo en ninguna carta de los Blackburn. Eso es un registro de propiedad. Una escritura. Y la escritura de esta posada estaba fuera de su cajón en su cesta de rearchivar ayer por la mañana, manipulada, sobre el escritorio de una mujer que me había dicho dos veces que jamás lee los archivos que tiene a sus espaldas.</w:t>
+        <w:t>Entonces me volví hacia Vera, y lo hice con suavidad, porque estaba allí sentada temblando, con los brazos cruzados alrededor de su cuerpo. Ya había recorrido por su cuenta la mayor parte del camino hacia la verdad.</w:t>
+      </w:r>
+    </w:p>
+    <w:p>
+      <w:r>
+        <w:t xml:space="preserve">—Vera —dije—. Theo tenía la parte del robo. Pero las notas sabían que la posada se había comprado con el dinero del broche, y eso jamás estuvo en ninguna carta de los Blackburn. Eso es un registro de propiedad. Una escritura. Y la escritura de esta posada estaba fuera de su cajón en su cesta de rearchivo ayer por la mañana, manipulada, sobre el escritorio de una mujer que me había dicho dos veces que jamás lee los archivos que tiene a sus espaldas.</w:t>
       </w:r>
     </w:p>
     <w:p>
@@ -4533,7 +4533,7 @@
     </w:p>
     <w:p>
       <w:r>
-        <w:t>Entonces ella se derrumbó, de golpe, igual que Theo, y lo que brotó de ella fue miseria, pura y profunda.</w:t>
+        <w:t>Entonces ella se derrumbó, de golpe, igual que Theo, y lo que brotó de ella fue desdicha, pura y profunda.</w:t>
       </w:r>
     </w:p>
     <w:p>
@@ -4626,7 +4626,7 @@
     <w:p/>
     <w:p>
       <w:r>
-        <w:t xml:space="preserve">Renunció. No por una temporada, para volver a deslizarse discretamente en el sillón una vez que el pueblo se hubiera cansado de estar enfadado. Dimitió como director de la Sociedad Histórica de Frost Falls, y la junta, una vez que lo supo todo, aceptó la dimisión, y en serio. Un hombre no podía extorsionar a un vecino usando la colección y el membrete de la Sociedad, y luego conservar las llaves del lugar.</w:t>
+        <w:t xml:space="preserve">Renunció. No por una temporada, para volver a deslizarse discretamente en el sillón una vez que el pueblo se hubiera cansado de estar enfadado. Dimitió como director de la Sociedad Histórica de Frost Falls, y la junta, una vez que lo supo todo, aceptó la dimisión, y en serio. Un hombre no podía extorsionar a un vecino usando la colección y el papel de carta de la Sociedad, y luego conservar las llaves del lugar.</w:t>
       </w:r>
     </w:p>
     <w:p/>
@@ -4668,7 +4668,7 @@
     <w:p/>
     <w:p>
       <w:r>
-        <w:t>Lloró. Me abrazó, esta mujer rígida y abotonada a la que jamás había visto abrazar a un alma, y me dio las gracias contra el hombro. Luego se marchó conduciendo hacia la casa de su hermana, y Pip y yo caminamos a casa entre la penumbra temprana. No había ni rastro de triunfo. Estaba pesada y agotada hasta los huesos, como si hubiera limpiado una herida hasta el fondo: dolía muchísimo más que dejarla estar, pero ahora podía sanar.</w:t>
+        <w:t>Lloró. Me abrazó, esta mujer rígida y abotonada a la que jamás había visto abrazar a un alma, y me dio las gracias contra el hombro. Luego se marchó conduciendo hacia la casa de su hermana, y Pip y yo caminamos a casa entre la penumbra temprana. No había ni rastro de triunfo. Me sentía abatida y agotada hasta los huesos, como si hubiera limpiado una herida hasta el fondo: dolía muchísimo más que dejarla estar, pero ahora podía sanar.</w:t>
       </w:r>
     </w:p>
     <w:p/>
@@ -4717,7 +4717,7 @@
     </w:p>
     <w:p>
       <w:r>
-        <w:t>Era una oferta amable, hecha de todo corazón. Habría funcionado, además, en el sentido más estricto. Un cheque, y los problemas de dinero de la Sociedad habrían desaparecido, los mismos problemas que habían llevado a Theo casi a la locura para hacer lo que hizo. Una parte de mí, de pie y cansada en aquel porche frío, quería agarrarlo con ambas manos y darlo por hecho.</w:t>
+        <w:t>Era una oferta amable, hecha de todo corazón. Habría funcionado, además, en el sentido más estricto. Un cheque, y los problemas de dinero de la Sociedad habrían desaparecido, los mismos problemas que habían llevado a Theo casi a la locura para hacer lo que hizo. Una parte de mí, de pie y cansada en aquel porche frío, quería agarrarlo con ambas manos y darlo por zanjado.</w:t>
       </w:r>
     </w:p>
     <w:p>
@@ -4823,7 +4823,7 @@
     </w:p>
     <w:p>
       <w:r>
-        <w:t xml:space="preserve">Y Fiona lo hizo. Dejó que Claire lo escribiera para el Gazette, la versión verídica y completa, con los documentos de Neil de por medio. No la versión de cotilleo con su villano limpio y su crimen limpio, sino la de verdad. Constance Okafor, una criada de diecinueve años en el invierno de 1924, a la que llevaban meses sin pagar, con su madre muriéndose tres calles más allá sin dinero para un médico, a la que le decían que estuviera agradecida por tener un techo mientras sacudía el polvo, todos los días, de un broche que valía más de lo que ganaría en tres vidas. Una muchacha desesperada que cogió lo único que tenía a mano, de una familia que le había robado primero, y lo convirtió en cien años de bienvenida sincera para los viajeros que pasaban por Frost Falls en pleno frío.</w:t>
+        <w:t xml:space="preserve">Y Fiona lo hizo. Dejó que Claire lo escribiera para el Gazette, la versión verídica y completa, con los documentos de Neil como respaldo. No la versión de cotilleo con su villano limpio y su crimen limpio, sino la de verdad. Constance Okafor, una criada de diecinueve años en el invierno de 1924, a la que llevaban meses sin pagar, con su madre muriéndose tres calles más allá sin dinero para un médico, a la que le decían que estuviera agradecida por tener un techo mientras sacudía el polvo, todos los días, de un broche que valía más de lo que ganaría en tres vidas. Una muchacha desesperada que cogió lo único que tenía a mano, de una familia que le había robado primero, y lo convirtió en cien años de bienvenida sincera para los viajeros que pasaban por Frost Falls en pleno frío.</w:t>
       </w:r>
     </w:p>
     <w:p>
@@ -5366,7 +5366,7 @@
     <w:p/>
     <w:p>
       <w:r>
-        <w:t>Había nevado durante la noche. No la nevada temprana de octubre, desaparecida en un abrir y cerrar de días templados. Nieve de verdad. De esa de plena temporada que había empezado en Halloween y duraría hasta la primavera. Ahora cubría la avenida Evergreen con unos buenos y limpios quince centímetros, crujiendo bajo los pies cuando alguien entraba pisando fuerte. Durante el fin de semana, las tiendas habían cambiado sus esqueletos y calabazas de Halloween por tallos de maíz y pavos de papel, aunque las calabazas lisas seguían en los porches, buenas hasta Acción de Gracias. La avenida se había quedado silenciosa después de Halloween, en la tregua previa al largo y brillante impulso hacia la Navidad.</w:t>
+        <w:t>Había nevado durante la noche. No la nevada temprana de octubre, que se había esfumado con una racha de días templados. Nieve de verdad. De esa de plena temporada que había empezado en Halloween y duraría hasta la primavera. Ahora cubría la avenida Evergreen con unos buenos y limpios quince centímetros, crujiendo bajo los pies cuando alguien entraba pisando fuerte. Durante el fin de semana, las tiendas habían cambiado sus esqueletos y calabazas de Halloween por tallos de maíz y pavos de papel, aunque las calabazas lisas seguían en los porches, buenas hasta Acción de Gracias. La avenida se había quedado silenciosa después de Halloween, en la tregua previa al largo y brillante impulso hacia la Navidad.</w:t>
       </w:r>
     </w:p>
     <w:p/>
@@ -5396,7 +5396,7 @@
     <w:p/>
     <w:p>
       <w:r>
-        <w:t>—El mío se parece al tuyo.</w:t>
+        <w:t>—El mío es igualito que el tuyo.</w:t>
       </w:r>
     </w:p>
     <w:p/>
@@ -5438,7 +5438,7 @@
     <w:p/>
     <w:p>
       <w:r>
-        <w:t xml:space="preserve">Estábamos todas allí esa mañana. Todo el círculo, cuando nadie estaba postrada por un resfriado o cuidando nietos. Olivia a la cabeza en su propia tienda, con madejas de lana amontonadas a su espalda en todos los colores que un invierno pudiera desear. Dot a su lado, sencilla y rápida. Luego Claire Bennett, que escribía para el Gazette, con un cuaderno abierto en el reposabrazos de su silla porque Claire nunca estaba completamente fuera de servicio. No dejaba de dejar la corona para apuntar una línea y la retomaba un tiempo por detrás del resto de nosotras. Ivy al lado, cuya risa era tan grande y tan espontánea que la tienda parecía más luminosa con ella dentro. De algún modo se le había metido abeto en el pelo sin darse cuenta. Martha, la maestra retirada, viuda desde hacía muchos años, con su perrito blanco Snowball dormido contra su tobillo. Su mano bajaba de vez en cuando para tocarle la oreja. Para asegurarse de que seguía ahí. Y Ellie, amable y sin prisas, que hacía voluntariado en el hospital tres días a la semana. Aportaba esa misma ternura constante a un armazón de alambre. Su corona parecía menos fabricada que crecida.</w:t>
+        <w:t xml:space="preserve">Estábamos todas allí esa mañana. Todo el círculo, cuando nadie estaba postrada por un resfriado o cuidando nietos. Olivia a la cabeza en su propia tienda, con madejas de lana amontonadas a su espalda en todos los colores que un invierno pudiera desear. Dot a su lado, sencilla y rápida. Luego Claire Bennett, que escribía para el Gazette, con un cuaderno abierto en el reposabrazos de su silla porque Claire nunca estaba completamente fuera de servicio. No dejaba de dejar la corona para apuntar una línea y la retomaba un compás por detrás del resto de nosotras. Ivy al lado, cuya risa era tan grande y tan espontánea que la tienda parecía más luminosa con ella dentro. De algún modo se le había metido abeto en el pelo sin darse cuenta. Martha, la maestra retirada, viuda desde hacía muchos años, con su perrito blanco Snowball dormido contra su tobillo. Su mano bajaba de vez en cuando para tocarle la oreja. Para asegurarse de que seguía ahí. Y Ellie, amable y sin prisas, que hacía voluntariado en el hospital tres días a la semana. Aportaba esa misma ternura constante a un armazón de alambre. Su corona parecía menos fabricada que crecida.</w:t>
       </w:r>
     </w:p>
     <w:p/>
@@ -5705,7 +5705,7 @@
     <w:p/>
     <w:p>
       <w:r>
-        <w:t>Y esa era la postura sensata, y el círculo la adoptó, y alguien dijo los niños de hoy en día y otra persona dijo que nunca había nevado así cuando yo era niña, y la charla siguió su curso, como suele hacer la charla de círculo, y Ivy volvió a por otra galleta de jengibre. Pero me quedé en la ventana un momento más que las demás, con mi corona a medias en la mano. Miré aquel muñeco de nieve del medio orientado hacia la manzana de arriba. Miré la nieve lisa e ininterrumpida que las botas de ningún bromista habían tocado. Y no dije lo que estaba pensando.</w:t>
+        <w:t>Y esa era la postura sensata, y el círculo la adoptó, y alguien dijo los niños de hoy en día y otra persona dijo que nunca nevaba así cuando ella era niña, y la charla siguió su curso, como suele hacer la charla de círculo, y Ivy volvió a por otra galleta de jengibre. Pero me quedé en la ventana un momento más que las demás, con mi corona a medias en la mano. Miré aquel muñeco de nieve del medio orientado hacia la manzana de arriba. Miré la nieve lisa e ininterrumpida que las botas de ningún bromista habían tocado. Y no dije lo que estaba pensando.</w:t>
       </w:r>
     </w:p>
     <w:p/>

</xml_diff>